<commit_message>
Document the category context menu and the Glass focus-ring fix
Changelog entries for the community category long-press menu, the Glass
mode focus highlight, and the Customize cursor tracking. User guide gains
the hold-OK shortcut and how it relates to Settings, and the product brief
records it beside the existing customization bullet.
</commit_message>
<xml_diff>
--- a/extras/OwnTV_Master_Product_Brief.docx
+++ b/extras/OwnTV_Master_Product_Brief.docx
@@ -1348,6 +1348,14 @@
       </w:pPr>
       <w:r>
         <w:t>Customize per profile: focus a category name to open its paged item list; hide, rename and reorder categories or individual channels, movies and series; recover hidden items; filter either level to All, Visible or Hidden; page both levels with configurable Remote Shortcut actions (shipped default: CH+/Rewind toward first, CH−/Fast-forward toward last); and optionally protect the screen with a PIN.</w:t>
+      </w:r>
+    </w:p>
+    <w:p>
+      <w:pPr>
+        <w:pStyle w:val="ListBullet"/>
+      </w:pPr>
+      <w:r>
+        <w:t>Hide or move a category from the browse screen: hold OK on a category in Live TV, Movies or Series for a Hide / Move menu, without going to Settings. Opening the menu does not switch category. Changes are the same customizations Settings edits, so both places agree.</w:t>
       </w:r>
     </w:p>
     <w:p>

</xml_diff>